<commit_message>
Deployed dd9fc49d with MkDocs version: 1.6.1
</commit_message>
<xml_diff>
--- a/download/accounting_point.docx
+++ b/download/accounting_point.docx
@@ -2,7 +2,7 @@
 <file path=word/document.xml><?xml version="1.0" encoding="utf-8"?>
 <w:document xmlns:w="http://schemas.openxmlformats.org/wordprocessingml/2006/main" xmlns:m="http://schemas.openxmlformats.org/officeDocument/2006/math" xmlns:r="http://schemas.openxmlformats.org/officeDocument/2006/relationships" xmlns:o="urn:schemas-microsoft-com:office:office" xmlns:v="urn:schemas-microsoft-com:vml" xmlns:w10="urn:schemas-microsoft-com:office:word" xmlns:a="http://schemas.openxmlformats.org/drawingml/2006/main" xmlns:pic="http://schemas.openxmlformats.org/drawingml/2006/picture" xmlns:wp="http://schemas.openxmlformats.org/drawingml/2006/wordprocessingDrawing">
   <w:body>
-    <w:bookmarkStart w:id="44" w:name="accounting-point"/>
+    <w:bookmarkStart w:id="44" w:name="_56c8f55df9764c226069fff150f6b73368ef04b"/>
     <w:p>
       <w:pPr>
         <w:pStyle w:val="Overskrift1"/>
@@ -41,7 +41,7 @@
         <w:t xml:space="preserve">Data from Elhub.</w:t>
       </w:r>
     </w:p>
-    <w:bookmarkStart w:id="20" w:name="business-identifiers"/>
+    <w:bookmarkStart w:id="20" w:name="_3787186b6921922c4a89c96a165f1a4accc6b38"/>
     <w:p>
       <w:pPr>
         <w:pStyle w:val="Overskrift2"/>
@@ -59,7 +59,7 @@
       </w:r>
     </w:p>
     <w:bookmarkEnd w:id="20"/>
-    <w:bookmarkStart w:id="23" w:name="relevant-links"/>
+    <w:bookmarkStart w:id="23" w:name="_79afa4f38a91732ffbb4c55883dc88cdfa88c95"/>
     <w:p>
       <w:pPr>
         <w:pStyle w:val="Overskrift2"/>
@@ -103,7 +103,7 @@
       </w:hyperlink>
     </w:p>
     <w:bookmarkEnd w:id="23"/>
-    <w:bookmarkStart w:id="25" w:name="fields"/>
+    <w:bookmarkStart w:id="25" w:name="_fields"/>
     <w:p>
       <w:pPr>
         <w:pStyle w:val="Overskrift2"/>
@@ -472,7 +472,7 @@
       </w:tr>
     </w:tbl>
     <w:bookmarkEnd w:id="25"/>
-    <w:bookmarkStart w:id="26" w:name="validation-rules"/>
+    <w:bookmarkStart w:id="26" w:name="_59f998a8f2e664043807375c511f11331608f95"/>
     <w:p>
       <w:pPr>
         <w:pStyle w:val="Overskrift2"/>
@@ -490,7 +490,7 @@
       </w:r>
     </w:p>
     <w:bookmarkEnd w:id="26"/>
-    <w:bookmarkStart w:id="27" w:name="notifications"/>
+    <w:bookmarkStart w:id="27" w:name="_notifications"/>
     <w:p>
       <w:pPr>
         <w:pStyle w:val="Overskrift2"/>
@@ -508,7 +508,7 @@
       </w:r>
     </w:p>
     <w:bookmarkEnd w:id="27"/>
-    <w:bookmarkStart w:id="43" w:name="authorization"/>
+    <w:bookmarkStart w:id="43" w:name="_authorization"/>
     <w:p>
       <w:pPr>
         <w:pStyle w:val="Overskrift2"/>
@@ -517,7 +517,7 @@
         <w:t xml:space="preserve">Authorization</w:t>
       </w:r>
     </w:p>
-    <w:bookmarkStart w:id="40" w:name="resource-level-authorization"/>
+    <w:bookmarkStart w:id="40" w:name="_ea7458f1c517e163e4c33e527853f16a851511d"/>
     <w:p>
       <w:pPr>
         <w:pStyle w:val="Overskrift3"/>
@@ -570,7 +570,7 @@
         <w:t xml:space="preserve">.</w:t>
       </w:r>
     </w:p>
-    <w:bookmarkStart w:id="29" w:name="entity"/>
+    <w:bookmarkStart w:id="29" w:name="_entity"/>
     <w:p>
       <w:pPr>
         <w:pStyle w:val="Overskrift4"/>
@@ -588,7 +588,7 @@
       </w:r>
     </w:p>
     <w:bookmarkEnd w:id="29"/>
-    <w:bookmarkStart w:id="30" w:name="anonymous"/>
+    <w:bookmarkStart w:id="30" w:name="_anonymous"/>
     <w:p>
       <w:pPr>
         <w:pStyle w:val="Overskrift4"/>
@@ -606,7 +606,7 @@
       </w:r>
     </w:p>
     <w:bookmarkEnd w:id="30"/>
-    <w:bookmarkStart w:id="31" w:name="common"/>
+    <w:bookmarkStart w:id="31" w:name="_common"/>
     <w:p>
       <w:pPr>
         <w:pStyle w:val="Overskrift4"/>
@@ -624,7 +624,7 @@
       </w:r>
     </w:p>
     <w:bookmarkEnd w:id="31"/>
-    <w:bookmarkStart w:id="32" w:name="balance-responsible-party"/>
+    <w:bookmarkStart w:id="32" w:name="_33d042ea865d9ccdd21972e4941eb9a3e57dea9"/>
     <w:p>
       <w:pPr>
         <w:pStyle w:val="Overskrift4"/>
@@ -720,7 +720,7 @@
       </w:tr>
     </w:tbl>
     <w:bookmarkEnd w:id="32"/>
-    <w:bookmarkStart w:id="33" w:name="end-user"/>
+    <w:bookmarkStart w:id="33" w:name="_587ff7c550b65da706cc6ed28c28196eac21d0d"/>
     <w:p>
       <w:pPr>
         <w:pStyle w:val="Overskrift4"/>
@@ -738,7 +738,7 @@
       </w:r>
     </w:p>
     <w:bookmarkEnd w:id="33"/>
-    <w:bookmarkStart w:id="34" w:name="energy-supplier"/>
+    <w:bookmarkStart w:id="34" w:name="_0ae40e3cd02a5e6cf223650bdd6f54d616f5022"/>
     <w:p>
       <w:pPr>
         <w:pStyle w:val="Overskrift4"/>
@@ -756,7 +756,7 @@
       </w:r>
     </w:p>
     <w:bookmarkEnd w:id="34"/>
-    <w:bookmarkStart w:id="35" w:name="flexibility-information-system-operator"/>
+    <w:bookmarkStart w:id="35" w:name="_205d448ec611aeec17125b0a6a21826729c6ace"/>
     <w:p>
       <w:pPr>
         <w:pStyle w:val="Overskrift4"/>
@@ -851,7 +851,7 @@
       </w:tr>
     </w:tbl>
     <w:bookmarkEnd w:id="35"/>
-    <w:bookmarkStart w:id="36" w:name="organisation"/>
+    <w:bookmarkStart w:id="36" w:name="_organisation"/>
     <w:p>
       <w:pPr>
         <w:pStyle w:val="Overskrift4"/>
@@ -869,7 +869,7 @@
       </w:r>
     </w:p>
     <w:bookmarkEnd w:id="36"/>
-    <w:bookmarkStart w:id="37" w:name="system-operator"/>
+    <w:bookmarkStart w:id="37" w:name="_fc1969e12ffa04b3f787795e7ddfde406a09f5a"/>
     <w:p>
       <w:pPr>
         <w:pStyle w:val="Overskrift4"/>
@@ -1034,7 +1034,7 @@
       </w:tr>
     </w:tbl>
     <w:bookmarkEnd w:id="37"/>
-    <w:bookmarkStart w:id="38" w:name="service-provider"/>
+    <w:bookmarkStart w:id="38" w:name="_b462e6d210ec9c712e4b2292c76af28fc130787"/>
     <w:p>
       <w:pPr>
         <w:pStyle w:val="Overskrift4"/>
@@ -1130,7 +1130,7 @@
       </w:tr>
     </w:tbl>
     <w:bookmarkEnd w:id="38"/>
-    <w:bookmarkStart w:id="39" w:name="third-party"/>
+    <w:bookmarkStart w:id="39" w:name="_27deb66bcd01342a3df78b2190e8adbdc1219d6"/>
     <w:p>
       <w:pPr>
         <w:pStyle w:val="Overskrift4"/>
@@ -1149,7 +1149,7 @@
     </w:p>
     <w:bookmarkEnd w:id="39"/>
     <w:bookmarkEnd w:id="40"/>
-    <w:bookmarkStart w:id="42" w:name="field-level-authorization"/>
+    <w:bookmarkStart w:id="42" w:name="_12ddb80e42fe95428c38865dcd3a67097e70e69"/>
     <w:p>
       <w:pPr>
         <w:pStyle w:val="Overskrift3"/>

</xml_diff>

<commit_message>
Deployed 376369d0 with MkDocs version: 1.6.1
</commit_message>
<xml_diff>
--- a/download/accounting_point.docx
+++ b/download/accounting_point.docx
@@ -1351,6 +1351,22 @@
             <w:pPr>
               <w:pStyle w:val="Compact"/>
             </w:pPr>
+          </w:p>
+        </w:tc>
+        <w:tc>
+          <w:tcPr/>
+          <w:p>
+            <w:pPr>
+              <w:pStyle w:val="Compact"/>
+            </w:pPr>
+          </w:p>
+        </w:tc>
+        <w:tc>
+          <w:tcPr/>
+          <w:p>
+            <w:pPr>
+              <w:pStyle w:val="Compact"/>
+            </w:pPr>
             <w:r>
               <w:t xml:space="preserve">R</w:t>
             </w:r>
@@ -1384,31 +1400,6 @@
             <w:pPr>
               <w:pStyle w:val="Compact"/>
             </w:pPr>
-            <w:r>
-              <w:t xml:space="preserve">R</w:t>
-            </w:r>
-          </w:p>
-        </w:tc>
-        <w:tc>
-          <w:tcPr/>
-          <w:p>
-            <w:pPr>
-              <w:pStyle w:val="Compact"/>
-            </w:pPr>
-            <w:r>
-              <w:t xml:space="preserve">R</w:t>
-            </w:r>
-          </w:p>
-        </w:tc>
-        <w:tc>
-          <w:tcPr/>
-          <w:p>
-            <w:pPr>
-              <w:pStyle w:val="Compact"/>
-            </w:pPr>
-            <w:r>
-              <w:t xml:space="preserve">R</w:t>
-            </w:r>
           </w:p>
         </w:tc>
         <w:tc>
@@ -1457,6 +1448,22 @@
             <w:pPr>
               <w:pStyle w:val="Compact"/>
             </w:pPr>
+          </w:p>
+        </w:tc>
+        <w:tc>
+          <w:tcPr/>
+          <w:p>
+            <w:pPr>
+              <w:pStyle w:val="Compact"/>
+            </w:pPr>
+          </w:p>
+        </w:tc>
+        <w:tc>
+          <w:tcPr/>
+          <w:p>
+            <w:pPr>
+              <w:pStyle w:val="Compact"/>
+            </w:pPr>
             <w:r>
               <w:t xml:space="preserve">R</w:t>
             </w:r>
@@ -1490,31 +1497,6 @@
             <w:pPr>
               <w:pStyle w:val="Compact"/>
             </w:pPr>
-            <w:r>
-              <w:t xml:space="preserve">R</w:t>
-            </w:r>
-          </w:p>
-        </w:tc>
-        <w:tc>
-          <w:tcPr/>
-          <w:p>
-            <w:pPr>
-              <w:pStyle w:val="Compact"/>
-            </w:pPr>
-            <w:r>
-              <w:t xml:space="preserve">R</w:t>
-            </w:r>
-          </w:p>
-        </w:tc>
-        <w:tc>
-          <w:tcPr/>
-          <w:p>
-            <w:pPr>
-              <w:pStyle w:val="Compact"/>
-            </w:pPr>
-            <w:r>
-              <w:t xml:space="preserve">R</w:t>
-            </w:r>
           </w:p>
         </w:tc>
         <w:tc>
@@ -1563,6 +1545,22 @@
             <w:pPr>
               <w:pStyle w:val="Compact"/>
             </w:pPr>
+          </w:p>
+        </w:tc>
+        <w:tc>
+          <w:tcPr/>
+          <w:p>
+            <w:pPr>
+              <w:pStyle w:val="Compact"/>
+            </w:pPr>
+          </w:p>
+        </w:tc>
+        <w:tc>
+          <w:tcPr/>
+          <w:p>
+            <w:pPr>
+              <w:pStyle w:val="Compact"/>
+            </w:pPr>
             <w:r>
               <w:t xml:space="preserve">R</w:t>
             </w:r>
@@ -1596,31 +1594,6 @@
             <w:pPr>
               <w:pStyle w:val="Compact"/>
             </w:pPr>
-            <w:r>
-              <w:t xml:space="preserve">R</w:t>
-            </w:r>
-          </w:p>
-        </w:tc>
-        <w:tc>
-          <w:tcPr/>
-          <w:p>
-            <w:pPr>
-              <w:pStyle w:val="Compact"/>
-            </w:pPr>
-            <w:r>
-              <w:t xml:space="preserve">R</w:t>
-            </w:r>
-          </w:p>
-        </w:tc>
-        <w:tc>
-          <w:tcPr/>
-          <w:p>
-            <w:pPr>
-              <w:pStyle w:val="Compact"/>
-            </w:pPr>
-            <w:r>
-              <w:t xml:space="preserve">R</w:t>
-            </w:r>
           </w:p>
         </w:tc>
         <w:tc>
@@ -1669,6 +1642,22 @@
             <w:pPr>
               <w:pStyle w:val="Compact"/>
             </w:pPr>
+          </w:p>
+        </w:tc>
+        <w:tc>
+          <w:tcPr/>
+          <w:p>
+            <w:pPr>
+              <w:pStyle w:val="Compact"/>
+            </w:pPr>
+          </w:p>
+        </w:tc>
+        <w:tc>
+          <w:tcPr/>
+          <w:p>
+            <w:pPr>
+              <w:pStyle w:val="Compact"/>
+            </w:pPr>
             <w:r>
               <w:t xml:space="preserve">R</w:t>
             </w:r>
@@ -1702,31 +1691,6 @@
             <w:pPr>
               <w:pStyle w:val="Compact"/>
             </w:pPr>
-            <w:r>
-              <w:t xml:space="preserve">R</w:t>
-            </w:r>
-          </w:p>
-        </w:tc>
-        <w:tc>
-          <w:tcPr/>
-          <w:p>
-            <w:pPr>
-              <w:pStyle w:val="Compact"/>
-            </w:pPr>
-            <w:r>
-              <w:t xml:space="preserve">R</w:t>
-            </w:r>
-          </w:p>
-        </w:tc>
-        <w:tc>
-          <w:tcPr/>
-          <w:p>
-            <w:pPr>
-              <w:pStyle w:val="Compact"/>
-            </w:pPr>
-            <w:r>
-              <w:t xml:space="preserve">R</w:t>
-            </w:r>
           </w:p>
         </w:tc>
         <w:tc>
@@ -1775,6 +1739,22 @@
             <w:pPr>
               <w:pStyle w:val="Compact"/>
             </w:pPr>
+          </w:p>
+        </w:tc>
+        <w:tc>
+          <w:tcPr/>
+          <w:p>
+            <w:pPr>
+              <w:pStyle w:val="Compact"/>
+            </w:pPr>
+          </w:p>
+        </w:tc>
+        <w:tc>
+          <w:tcPr/>
+          <w:p>
+            <w:pPr>
+              <w:pStyle w:val="Compact"/>
+            </w:pPr>
             <w:r>
               <w:t xml:space="preserve">R</w:t>
             </w:r>
@@ -1808,31 +1788,6 @@
             <w:pPr>
               <w:pStyle w:val="Compact"/>
             </w:pPr>
-            <w:r>
-              <w:t xml:space="preserve">R</w:t>
-            </w:r>
-          </w:p>
-        </w:tc>
-        <w:tc>
-          <w:tcPr/>
-          <w:p>
-            <w:pPr>
-              <w:pStyle w:val="Compact"/>
-            </w:pPr>
-            <w:r>
-              <w:t xml:space="preserve">R</w:t>
-            </w:r>
-          </w:p>
-        </w:tc>
-        <w:tc>
-          <w:tcPr/>
-          <w:p>
-            <w:pPr>
-              <w:pStyle w:val="Compact"/>
-            </w:pPr>
-            <w:r>
-              <w:t xml:space="preserve">R</w:t>
-            </w:r>
           </w:p>
         </w:tc>
         <w:tc>
@@ -1881,6 +1836,22 @@
             <w:pPr>
               <w:pStyle w:val="Compact"/>
             </w:pPr>
+          </w:p>
+        </w:tc>
+        <w:tc>
+          <w:tcPr/>
+          <w:p>
+            <w:pPr>
+              <w:pStyle w:val="Compact"/>
+            </w:pPr>
+          </w:p>
+        </w:tc>
+        <w:tc>
+          <w:tcPr/>
+          <w:p>
+            <w:pPr>
+              <w:pStyle w:val="Compact"/>
+            </w:pPr>
             <w:r>
               <w:t xml:space="preserve">R</w:t>
             </w:r>
@@ -1914,31 +1885,6 @@
             <w:pPr>
               <w:pStyle w:val="Compact"/>
             </w:pPr>
-            <w:r>
-              <w:t xml:space="preserve">R</w:t>
-            </w:r>
-          </w:p>
-        </w:tc>
-        <w:tc>
-          <w:tcPr/>
-          <w:p>
-            <w:pPr>
-              <w:pStyle w:val="Compact"/>
-            </w:pPr>
-            <w:r>
-              <w:t xml:space="preserve">R</w:t>
-            </w:r>
-          </w:p>
-        </w:tc>
-        <w:tc>
-          <w:tcPr/>
-          <w:p>
-            <w:pPr>
-              <w:pStyle w:val="Compact"/>
-            </w:pPr>
-            <w:r>
-              <w:t xml:space="preserve">R</w:t>
-            </w:r>
           </w:p>
         </w:tc>
         <w:tc>

</xml_diff>